<commit_message>
OO version of matrix implemented & UoC API fixed
</commit_message>
<xml_diff>
--- a/example/2 KAD/5 Assess Tool/AT2 Knowledge Based Assessment/Assessment Task Tool (F122A12).docx
+++ b/example/2 KAD/5 Assess Tool/AT2 Knowledge Based Assessment/Assessment Task Tool (F122A12).docx
@@ -1748,6 +1748,67 @@
                 <w:i/>
               </w:rPr>
               <w:t>Identify and explain several industry-recognised principles and techniques in machine learning. Discuss how these are applied in practice to improve the automation of work tasks and enhance organisational productivity. Provide real-world examples to illustrate the application of these principles and techniques.</w:t>
+            </w:r>
+            <w:r/>
+          </w:p>
+          <w:p>
+            <w:r/>
+            <w:r/>
+            <w:r/>
+          </w:p>
+          <w:p>
+            <w:r>
+              <w:rPr>
+                <w:b w:val="0"/>
+                <w:i/>
+              </w:rPr>
+              <w:t>Your answer here.</w:t>
+            </w:r>
+            <w:r/>
+          </w:p>
+          <w:p>
+            <w:r/>
+            <w:r/>
+            <w:r/>
+          </w:p>
+          <w:p/>
+          <w:p/>
+          <w:p/>
+          <w:p/>
+          <w:p/>
+          <w:p/>
+          <w:p/>
+          <w:p/>
+          <w:p/>
+          <w:p>
+            <w:r/>
+          </w:p>
+          <w:p>
+            <w:r/>
+          </w:p>
+          <w:p>
+            <w:r/>
+            <w:r/>
+            <w:r/>
+          </w:p>
+          <w:p>
+            <w:pPr>
+              <w:pStyle w:val="Heading4"/>
+            </w:pPr>
+            <w:r>
+              <w:t>Question 20: Advantages and Disadvantages of AI, ML, and DL (401.KE3)</w:t>
+            </w:r>
+            <w:r/>
+            <w:r/>
+            <w:r/>
+          </w:p>
+          <w:p>
+            <w:r>
+              <w:rPr>
+                <w:b w:val="0"/>
+                <w:i/>
+              </w:rPr>
+              <w:t>Describe the key advantages and disadvantages of implementing AI, ML, and DL technologies in organizations. Provide examples to illustrate how these technologies can both positively and negatively impact business operations.</w:t>
             </w:r>
             <w:r/>
           </w:p>

</xml_diff>